<commit_message>
Corrige documentacion y elimina backups
</commit_message>
<xml_diff>
--- a/Documentos/DOCUMENTACION_CODIGO_SARC.docx
+++ b/Documentos/DOCUMENTACION_CODIGO_SARC.docx
@@ -111,7 +111,7 @@
         <w:t>recuperación</w:t>
       </w:r>
       <w:r>
-        <w:t xml:space="preserve"> de contrasena, </w:t>
+        <w:t xml:space="preserve"> de contraseña, </w:t>
       </w:r>
       <w:r>
         <w:t>catálogo</w:t>
@@ -344,7 +344,7 @@
               <w:rPr>
                 <w:sz w:val="18"/>
               </w:rPr>
-              <w:t xml:space="preserve"> con correo y contrasena.</w:t>
+              <w:t xml:space="preserve"> con correo y contraseña.</w:t>
             </w:r>
           </w:p>
         </w:tc>
@@ -1069,7 +1069,7 @@
                 <w:color w:val="FFFFFF"/>
                 <w:sz w:val="18"/>
               </w:rPr>
-              <w:t>Descripcion</w:t>
+              <w:t>Descripción</w:t>
             </w:r>
           </w:p>
         </w:tc>
@@ -1175,7 +1175,7 @@
               <w:rPr>
                 <w:sz w:val="18"/>
               </w:rPr>
-              <w:t xml:space="preserve"> de contrasena por Firebase.</w:t>
+              <w:t xml:space="preserve"> de contraseña por Firebase.</w:t>
             </w:r>
           </w:p>
         </w:tc>
@@ -1269,7 +1269,7 @@
               <w:rPr>
                 <w:sz w:val="18"/>
               </w:rPr>
-              <w:t xml:space="preserve">Catalogo filtrable e </w:t>
+              <w:t xml:space="preserve">Catálogo filtrable e </w:t>
             </w:r>
             <w:r>
               <w:rPr>
@@ -1328,7 +1328,7 @@
               <w:rPr>
                 <w:sz w:val="18"/>
               </w:rPr>
-              <w:t xml:space="preserve">Descripcion, </w:t>
+              <w:t xml:space="preserve">Descripción, </w:t>
             </w:r>
             <w:r>
               <w:rPr>
@@ -1446,7 +1446,7 @@
               <w:rPr>
                 <w:sz w:val="18"/>
               </w:rPr>
-              <w:t xml:space="preserve">Avatar, modalidad, contrasena y </w:t>
+              <w:t xml:space="preserve">Avatar, modalidad, contraseña y </w:t>
             </w:r>
             <w:r>
               <w:rPr>
@@ -1495,7 +1495,7 @@
         <w:pStyle w:val="Listaconnmeros"/>
       </w:pPr>
       <w:r>
-        <w:t>index.html importa shared/js/app.js como modulo ES.</w:t>
+        <w:t>index.html importa shared/js/app.js como módulo ES.</w:t>
       </w:r>
     </w:p>
     <w:p>
@@ -1657,7 +1657,7 @@
               <w:rPr>
                 <w:sz w:val="18"/>
               </w:rPr>
-              <w:t xml:space="preserve">Decide que vista mostrar </w:t>
+              <w:t xml:space="preserve">Decide qué vista mostrar </w:t>
             </w:r>
             <w:r>
               <w:rPr>
@@ -2149,7 +2149,7 @@
         <w:t>navegación</w:t>
       </w:r>
       <w:r>
-        <w:t xml:space="preserve"> se basa en el hash de la URL. navigation.js cambia window.location.hash y app.js escucha el evento hashchange para decidir que vista renderizar. Si la ruta empieza por detalle/, app.js separa el identificador del curso y lo guarda en state.currentDetailId.</w:t>
+        <w:t xml:space="preserve"> se basa en el hash de la URL. navigation.js cambia window.location.hash y app.js escucha el evento hashchange para decidir qué vista renderizar. Si la ruta empieza por detalle/, app.js separa el identificador del curso y lo guarda en state.currentDetailId.</w:t>
       </w:r>
     </w:p>
     <w:p>
@@ -2187,7 +2187,7 @@
     </w:p>
     <w:p>
       <w:r>
-        <w:t xml:space="preserve">Firebase Authentication administra credenciales y sesiones. Firestore guarda los datos </w:t>
+        <w:t xml:space="preserve">Firebase Authentication administra credenciales y sesiónes. Firestore guarda los datos </w:t>
       </w:r>
       <w:r>
         <w:t>académicos</w:t>

</xml_diff>